<commit_message>
Update publication pipeline and adverse event outputs
</commit_message>
<xml_diff>
--- a/results/paper_tables/follow_up/01_dr_global_by_molecule.docx
+++ b/results/paper_tables/follow_up/01_dr_global_by_molecule.docx
@@ -17,7 +17,7 @@
         <w:ind w:left="60" w:right="60" w:firstLine="0" w:firstLineChars="0"/>
       </w:pPr>
       <w:r>
-        <w:t xml:space="preserve">Global dose–response per molecule (all AE pooled)</w:t>
+        <w:t xml:space="preserve">Global dose-response by molecule</w:t>
       </w:r>
     </w:p>
     <w:tbl xmlns:a="http://schemas.openxmlformats.org/drawingml/2006/main" xmlns:pic="http://schemas.openxmlformats.org/drawingml/2006/picture">
@@ -27,15 +27,15 @@
         <w:tblLook w:firstRow="1" w:lastRow="0" w:firstColumn="0" w:lastColumn="0" w:noHBand="0" w:noVBand="1"/>
       </w:tblPr>
       <w:tblGrid>
-        <w:gridCol w:w="1080"/>
-        <w:gridCol w:w="1080"/>
-        <w:gridCol w:w="1080"/>
-        <w:gridCol w:w="1080"/>
-        <w:gridCol w:w="1080"/>
+        <w:gridCol w:w="1324"/>
+        <w:gridCol w:w="954"/>
+        <w:gridCol w:w="1144"/>
+        <w:gridCol w:w="1164"/>
+        <w:gridCol w:w="754"/>
       </w:tblGrid>
       <w:tr>
         <w:trPr>
-          <w:trHeight w:val="360" w:hRule="auto"/>
+          <w:trHeight w:val="474" w:hRule="auto"/>
           <w:tblHeader/>
         </w:trPr>
         header1
@@ -47,7 +47,7 @@
               <w:left w:val="none" w:sz="0" w:space="0" w:color="000000"/>
               <w:right w:val="none" w:sz="0" w:space="0" w:color="000000"/>
             </w:tcBorders>
-            <w:shd w:val="clear" w:color="auto" w:fill="FFFFFF"/>
+            <w:shd w:val="clear" w:color="auto" w:fill="F4F1FA"/>
             <w:tcMar>
               <w:top w:w="0" w:type="dxa"/>
               <w:bottom w:w="0" w:type="dxa"/>
@@ -65,29 +65,29 @@
                 <w:left w:val="none" w:sz="0" w:space="0" w:color="000000"/>
                 <w:right w:val="none" w:sz="0" w:space="0" w:color="000000"/>
               </w:pBdr>
-              <w:spacing w:after="100" w:before="100" w:line="240"/>
-              <w:ind w:left="100" w:right="100" w:firstLine="0" w:firstLineChars="0"/>
-              <w:rPr>
-                <w:rFonts w:ascii="Helvetica" w:hAnsi="Helvetica" w:eastAsia="Helvetica" w:cs="Helvetica"/>
-                <w:i w:val="false"/>
-                <w:b w:val="false"/>
-                <w:u w:val="none"/>
-                <w:strike w:val="false"/>
-                <w:sz w:val="22"/>
-                <w:szCs w:val="22"/>
-                <w:color w:val="000000"/>
+              <w:spacing w:after="60" w:before="60" w:line="240"/>
+              <w:ind w:left="60" w:right="60" w:firstLine="0" w:firstLineChars="0"/>
+              <w:rPr>
+                <w:rFonts w:ascii="Helvetica" w:hAnsi="Helvetica" w:eastAsia="Helvetica" w:cs="Helvetica"/>
+                <w:i w:val="false"/>
+                <w:b w:val="true"/>
+                <w:u w:val="none"/>
+                <w:strike w:val="false"/>
+                <w:sz w:val="18"/>
+                <w:szCs w:val="18"/>
+                <w:color w:val="24212B"/>
               </w:rPr>
             </w:pPr>
             <w:r>
               <w:rPr>
                 <w:rFonts w:ascii="Helvetica" w:hAnsi="Helvetica" w:eastAsia="Helvetica" w:cs="Helvetica"/>
                 <w:i w:val="false"/>
-                <w:b w:val="false"/>
-                <w:u w:val="none"/>
-                <w:strike w:val="false"/>
-                <w:sz w:val="22"/>
-                <w:szCs w:val="22"/>
-                <w:color w:val="000000"/>
+                <w:b w:val="true"/>
+                <w:u w:val="none"/>
+                <w:strike w:val="false"/>
+                <w:sz w:val="18"/>
+                <w:szCs w:val="18"/>
+                <w:color w:val="24212B"/>
               </w:rPr>
               <w:t xml:space="preserve">Molecule</w:t>
             </w:r>
@@ -101,7 +101,7 @@
               <w:left w:val="none" w:sz="0" w:space="0" w:color="000000"/>
               <w:right w:val="none" w:sz="0" w:space="0" w:color="000000"/>
             </w:tcBorders>
-            <w:shd w:val="clear" w:color="auto" w:fill="FFFFFF"/>
+            <w:shd w:val="clear" w:color="auto" w:fill="F4F1FA"/>
             <w:tcMar>
               <w:top w:w="0" w:type="dxa"/>
               <w:bottom w:w="0" w:type="dxa"/>
@@ -112,36 +112,36 @@
           </w:tcPr>
           <w:p>
             <w:pPr>
-              <w:jc w:val="right"/>
+              <w:jc w:val="center"/>
               <w:pBdr>
                 <w:bottom w:val="none" w:sz="0" w:space="0" w:color="000000"/>
                 <w:top w:val="none" w:sz="0" w:space="0" w:color="000000"/>
                 <w:left w:val="none" w:sz="0" w:space="0" w:color="000000"/>
                 <w:right w:val="none" w:sz="0" w:space="0" w:color="000000"/>
               </w:pBdr>
-              <w:spacing w:after="100" w:before="100" w:line="240"/>
-              <w:ind w:left="100" w:right="100" w:firstLine="0" w:firstLineChars="0"/>
-              <w:rPr>
-                <w:rFonts w:ascii="Helvetica" w:hAnsi="Helvetica" w:eastAsia="Helvetica" w:cs="Helvetica"/>
-                <w:i w:val="false"/>
-                <w:b w:val="false"/>
-                <w:u w:val="none"/>
-                <w:strike w:val="false"/>
-                <w:sz w:val="22"/>
-                <w:szCs w:val="22"/>
-                <w:color w:val="000000"/>
+              <w:spacing w:after="60" w:before="60" w:line="240"/>
+              <w:ind w:left="60" w:right="60" w:firstLine="0" w:firstLineChars="0"/>
+              <w:rPr>
+                <w:rFonts w:ascii="Helvetica" w:hAnsi="Helvetica" w:eastAsia="Helvetica" w:cs="Helvetica"/>
+                <w:i w:val="false"/>
+                <w:b w:val="true"/>
+                <w:u w:val="none"/>
+                <w:strike w:val="false"/>
+                <w:sz w:val="18"/>
+                <w:szCs w:val="18"/>
+                <w:color w:val="24212B"/>
               </w:rPr>
             </w:pPr>
             <w:r>
               <w:rPr>
                 <w:rFonts w:ascii="Helvetica" w:hAnsi="Helvetica" w:eastAsia="Helvetica" w:cs="Helvetica"/>
                 <w:i w:val="false"/>
-                <w:b w:val="false"/>
-                <w:u w:val="none"/>
-                <w:strike w:val="false"/>
-                <w:sz w:val="22"/>
-                <w:szCs w:val="22"/>
-                <w:color w:val="000000"/>
+                <w:b w:val="true"/>
+                <w:u w:val="none"/>
+                <w:strike w:val="false"/>
+                <w:sz w:val="18"/>
+                <w:szCs w:val="18"/>
+                <w:color w:val="24212B"/>
               </w:rPr>
               <w:t xml:space="preserve">k (total)</w:t>
             </w:r>
@@ -155,7 +155,7 @@
               <w:left w:val="none" w:sz="0" w:space="0" w:color="000000"/>
               <w:right w:val="none" w:sz="0" w:space="0" w:color="000000"/>
             </w:tcBorders>
-            <w:shd w:val="clear" w:color="auto" w:fill="FFFFFF"/>
+            <w:shd w:val="clear" w:color="auto" w:fill="F4F1FA"/>
             <w:tcMar>
               <w:top w:w="0" w:type="dxa"/>
               <w:bottom w:w="0" w:type="dxa"/>
@@ -166,36 +166,36 @@
           </w:tcPr>
           <w:p>
             <w:pPr>
-              <w:jc w:val="left"/>
+              <w:jc w:val="center"/>
               <w:pBdr>
                 <w:bottom w:val="none" w:sz="0" w:space="0" w:color="000000"/>
                 <w:top w:val="none" w:sz="0" w:space="0" w:color="000000"/>
                 <w:left w:val="none" w:sz="0" w:space="0" w:color="000000"/>
                 <w:right w:val="none" w:sz="0" w:space="0" w:color="000000"/>
               </w:pBdr>
-              <w:spacing w:after="100" w:before="100" w:line="240"/>
-              <w:ind w:left="100" w:right="100" w:firstLine="0" w:firstLineChars="0"/>
-              <w:rPr>
-                <w:rFonts w:ascii="Helvetica" w:hAnsi="Helvetica" w:eastAsia="Helvetica" w:cs="Helvetica"/>
-                <w:i w:val="false"/>
-                <w:b w:val="false"/>
-                <w:u w:val="none"/>
-                <w:strike w:val="false"/>
-                <w:sz w:val="22"/>
-                <w:szCs w:val="22"/>
-                <w:color w:val="000000"/>
+              <w:spacing w:after="60" w:before="60" w:line="240"/>
+              <w:ind w:left="60" w:right="60" w:firstLine="0" w:firstLineChars="0"/>
+              <w:rPr>
+                <w:rFonts w:ascii="Helvetica" w:hAnsi="Helvetica" w:eastAsia="Helvetica" w:cs="Helvetica"/>
+                <w:i w:val="false"/>
+                <w:b w:val="true"/>
+                <w:u w:val="none"/>
+                <w:strike w:val="false"/>
+                <w:sz w:val="18"/>
+                <w:szCs w:val="18"/>
+                <w:color w:val="24212B"/>
               </w:rPr>
             </w:pPr>
             <w:r>
               <w:rPr>
                 <w:rFonts w:ascii="Helvetica" w:hAnsi="Helvetica" w:eastAsia="Helvetica" w:cs="Helvetica"/>
                 <w:i w:val="false"/>
-                <w:b w:val="false"/>
-                <w:u w:val="none"/>
-                <w:strike w:val="false"/>
-                <w:sz w:val="22"/>
-                <w:szCs w:val="22"/>
-                <w:color w:val="000000"/>
+                <w:b w:val="true"/>
+                <w:u w:val="none"/>
+                <w:strike w:val="false"/>
+                <w:sz w:val="18"/>
+                <w:szCs w:val="18"/>
+                <w:color w:val="24212B"/>
               </w:rPr>
               <w:t xml:space="preserve">Q (model)</w:t>
             </w:r>
@@ -209,7 +209,7 @@
               <w:left w:val="none" w:sz="0" w:space="0" w:color="000000"/>
               <w:right w:val="none" w:sz="0" w:space="0" w:color="000000"/>
             </w:tcBorders>
-            <w:shd w:val="clear" w:color="auto" w:fill="FFFFFF"/>
+            <w:shd w:val="clear" w:color="auto" w:fill="F4F1FA"/>
             <w:tcMar>
               <w:top w:w="0" w:type="dxa"/>
               <w:bottom w:w="0" w:type="dxa"/>
@@ -220,36 +220,36 @@
           </w:tcPr>
           <w:p>
             <w:pPr>
-              <w:jc w:val="left"/>
+              <w:jc w:val="center"/>
               <w:pBdr>
                 <w:bottom w:val="none" w:sz="0" w:space="0" w:color="000000"/>
                 <w:top w:val="none" w:sz="0" w:space="0" w:color="000000"/>
                 <w:left w:val="none" w:sz="0" w:space="0" w:color="000000"/>
                 <w:right w:val="none" w:sz="0" w:space="0" w:color="000000"/>
               </w:pBdr>
-              <w:spacing w:after="100" w:before="100" w:line="240"/>
-              <w:ind w:left="100" w:right="100" w:firstLine="0" w:firstLineChars="0"/>
-              <w:rPr>
-                <w:rFonts w:ascii="Helvetica" w:hAnsi="Helvetica" w:eastAsia="Helvetica" w:cs="Helvetica"/>
-                <w:i w:val="false"/>
-                <w:b w:val="false"/>
-                <w:u w:val="none"/>
-                <w:strike w:val="false"/>
-                <w:sz w:val="22"/>
-                <w:szCs w:val="22"/>
-                <w:color w:val="000000"/>
+              <w:spacing w:after="60" w:before="60" w:line="240"/>
+              <w:ind w:left="60" w:right="60" w:firstLine="0" w:firstLineChars="0"/>
+              <w:rPr>
+                <w:rFonts w:ascii="Helvetica" w:hAnsi="Helvetica" w:eastAsia="Helvetica" w:cs="Helvetica"/>
+                <w:i w:val="false"/>
+                <w:b w:val="true"/>
+                <w:u w:val="none"/>
+                <w:strike w:val="false"/>
+                <w:sz w:val="18"/>
+                <w:szCs w:val="18"/>
+                <w:color w:val="24212B"/>
               </w:rPr>
             </w:pPr>
             <w:r>
               <w:rPr>
                 <w:rFonts w:ascii="Helvetica" w:hAnsi="Helvetica" w:eastAsia="Helvetica" w:cs="Helvetica"/>
                 <w:i w:val="false"/>
-                <w:b w:val="false"/>
-                <w:u w:val="none"/>
-                <w:strike w:val="false"/>
-                <w:sz w:val="22"/>
-                <w:szCs w:val="22"/>
-                <w:color w:val="000000"/>
+                <w:b w:val="true"/>
+                <w:u w:val="none"/>
+                <w:strike w:val="false"/>
+                <w:sz w:val="18"/>
+                <w:szCs w:val="18"/>
+                <w:color w:val="24212B"/>
               </w:rPr>
               <w:t xml:space="preserve">p (overall)</w:t>
             </w:r>
@@ -263,7 +263,7 @@
               <w:left w:val="none" w:sz="0" w:space="0" w:color="000000"/>
               <w:right w:val="none" w:sz="0" w:space="0" w:color="000000"/>
             </w:tcBorders>
-            <w:shd w:val="clear" w:color="auto" w:fill="FFFFFF"/>
+            <w:shd w:val="clear" w:color="auto" w:fill="F4F1FA"/>
             <w:tcMar>
               <w:top w:w="0" w:type="dxa"/>
               <w:bottom w:w="0" w:type="dxa"/>
@@ -274,36 +274,36 @@
           </w:tcPr>
           <w:p>
             <w:pPr>
-              <w:jc w:val="left"/>
+              <w:jc w:val="center"/>
               <w:pBdr>
                 <w:bottom w:val="none" w:sz="0" w:space="0" w:color="000000"/>
                 <w:top w:val="none" w:sz="0" w:space="0" w:color="000000"/>
                 <w:left w:val="none" w:sz="0" w:space="0" w:color="000000"/>
                 <w:right w:val="none" w:sz="0" w:space="0" w:color="000000"/>
               </w:pBdr>
-              <w:spacing w:after="100" w:before="100" w:line="240"/>
-              <w:ind w:left="100" w:right="100" w:firstLine="0" w:firstLineChars="0"/>
-              <w:rPr>
-                <w:rFonts w:ascii="Helvetica" w:hAnsi="Helvetica" w:eastAsia="Helvetica" w:cs="Helvetica"/>
-                <w:i w:val="false"/>
-                <w:b w:val="false"/>
-                <w:u w:val="none"/>
-                <w:strike w:val="false"/>
-                <w:sz w:val="22"/>
-                <w:szCs w:val="22"/>
-                <w:color w:val="000000"/>
+              <w:spacing w:after="60" w:before="60" w:line="240"/>
+              <w:ind w:left="60" w:right="60" w:firstLine="0" w:firstLineChars="0"/>
+              <w:rPr>
+                <w:rFonts w:ascii="Helvetica" w:hAnsi="Helvetica" w:eastAsia="Helvetica" w:cs="Helvetica"/>
+                <w:i w:val="false"/>
+                <w:b w:val="true"/>
+                <w:u w:val="none"/>
+                <w:strike w:val="false"/>
+                <w:sz w:val="18"/>
+                <w:szCs w:val="18"/>
+                <w:color w:val="24212B"/>
               </w:rPr>
             </w:pPr>
             <w:r>
               <w:rPr>
                 <w:rFonts w:ascii="Helvetica" w:hAnsi="Helvetica" w:eastAsia="Helvetica" w:cs="Helvetica"/>
                 <w:i w:val="false"/>
-                <w:b w:val="false"/>
-                <w:u w:val="none"/>
-                <w:strike w:val="false"/>
-                <w:sz w:val="22"/>
-                <w:szCs w:val="22"/>
-                <w:color w:val="000000"/>
+                <w:b w:val="true"/>
+                <w:u w:val="none"/>
+                <w:strike w:val="false"/>
+                <w:sz w:val="18"/>
+                <w:szCs w:val="18"/>
+                <w:color w:val="24212B"/>
               </w:rPr>
               <w:t xml:space="preserve">Stars</w:t>
             </w:r>
@@ -312,7 +312,7 @@
       </w:tr>
       <w:tr>
         <w:trPr>
-          <w:trHeight w:val="360" w:hRule="auto"/>
+          <w:trHeight w:val="433" w:hRule="auto"/>
         </w:trPr>
         body1
         <w:tc>
@@ -341,17 +341,17 @@
                 <w:left w:val="none" w:sz="0" w:space="0" w:color="000000"/>
                 <w:right w:val="none" w:sz="0" w:space="0" w:color="000000"/>
               </w:pBdr>
-              <w:spacing w:after="100" w:before="100" w:line="240"/>
-              <w:ind w:left="100" w:right="100" w:firstLine="0" w:firstLineChars="0"/>
-              <w:rPr>
-                <w:rFonts w:ascii="Helvetica" w:hAnsi="Helvetica" w:eastAsia="Helvetica" w:cs="Helvetica"/>
-                <w:i w:val="false"/>
-                <w:b w:val="false"/>
-                <w:u w:val="none"/>
-                <w:strike w:val="false"/>
-                <w:sz w:val="22"/>
-                <w:szCs w:val="22"/>
-                <w:color w:val="000000"/>
+              <w:spacing w:after="60" w:before="60" w:line="240"/>
+              <w:ind w:left="60" w:right="60" w:firstLine="0" w:firstLineChars="0"/>
+              <w:rPr>
+                <w:rFonts w:ascii="Helvetica" w:hAnsi="Helvetica" w:eastAsia="Helvetica" w:cs="Helvetica"/>
+                <w:i w:val="false"/>
+                <w:b w:val="false"/>
+                <w:u w:val="none"/>
+                <w:strike w:val="false"/>
+                <w:sz w:val="17"/>
+                <w:szCs w:val="17"/>
+                <w:color w:val="24212B"/>
               </w:rPr>
             </w:pPr>
             <w:r>
@@ -361,9 +361,9 @@
                 <w:b w:val="false"/>
                 <w:u w:val="none"/>
                 <w:strike w:val="false"/>
-                <w:sz w:val="22"/>
-                <w:szCs w:val="22"/>
-                <w:color w:val="000000"/>
+                <w:sz w:val="17"/>
+                <w:szCs w:val="17"/>
+                <w:color w:val="24212B"/>
               </w:rPr>
               <w:t xml:space="preserve">LSD</w:t>
             </w:r>
@@ -388,24 +388,24 @@
           </w:tcPr>
           <w:p>
             <w:pPr>
-              <w:jc w:val="right"/>
+              <w:jc w:val="center"/>
               <w:pBdr>
                 <w:bottom w:val="none" w:sz="0" w:space="0" w:color="000000"/>
                 <w:top w:val="none" w:sz="0" w:space="0" w:color="000000"/>
                 <w:left w:val="none" w:sz="0" w:space="0" w:color="000000"/>
                 <w:right w:val="none" w:sz="0" w:space="0" w:color="000000"/>
               </w:pBdr>
-              <w:spacing w:after="100" w:before="100" w:line="240"/>
-              <w:ind w:left="100" w:right="100" w:firstLine="0" w:firstLineChars="0"/>
-              <w:rPr>
-                <w:rFonts w:ascii="Helvetica" w:hAnsi="Helvetica" w:eastAsia="Helvetica" w:cs="Helvetica"/>
-                <w:i w:val="false"/>
-                <w:b w:val="false"/>
-                <w:u w:val="none"/>
-                <w:strike w:val="false"/>
-                <w:sz w:val="22"/>
-                <w:szCs w:val="22"/>
-                <w:color w:val="000000"/>
+              <w:spacing w:after="60" w:before="60" w:line="240"/>
+              <w:ind w:left="60" w:right="60" w:firstLine="0" w:firstLineChars="0"/>
+              <w:rPr>
+                <w:rFonts w:ascii="Helvetica" w:hAnsi="Helvetica" w:eastAsia="Helvetica" w:cs="Helvetica"/>
+                <w:i w:val="false"/>
+                <w:b w:val="false"/>
+                <w:u w:val="none"/>
+                <w:strike w:val="false"/>
+                <w:sz w:val="17"/>
+                <w:szCs w:val="17"/>
+                <w:color w:val="24212B"/>
               </w:rPr>
             </w:pPr>
             <w:r>
@@ -415,9 +415,9 @@
                 <w:b w:val="false"/>
                 <w:u w:val="none"/>
                 <w:strike w:val="false"/>
-                <w:sz w:val="22"/>
-                <w:szCs w:val="22"/>
-                <w:color w:val="000000"/>
+                <w:sz w:val="17"/>
+                <w:szCs w:val="17"/>
+                <w:color w:val="24212B"/>
               </w:rPr>
               <w:t xml:space="preserve">108</w:t>
             </w:r>
@@ -442,24 +442,24 @@
           </w:tcPr>
           <w:p>
             <w:pPr>
-              <w:jc w:val="left"/>
+              <w:jc w:val="center"/>
               <w:pBdr>
                 <w:bottom w:val="none" w:sz="0" w:space="0" w:color="000000"/>
                 <w:top w:val="none" w:sz="0" w:space="0" w:color="000000"/>
                 <w:left w:val="none" w:sz="0" w:space="0" w:color="000000"/>
                 <w:right w:val="none" w:sz="0" w:space="0" w:color="000000"/>
               </w:pBdr>
-              <w:spacing w:after="100" w:before="100" w:line="240"/>
-              <w:ind w:left="100" w:right="100" w:firstLine="0" w:firstLineChars="0"/>
-              <w:rPr>
-                <w:rFonts w:ascii="Helvetica" w:hAnsi="Helvetica" w:eastAsia="Helvetica" w:cs="Helvetica"/>
-                <w:i w:val="false"/>
-                <w:b w:val="false"/>
-                <w:u w:val="none"/>
-                <w:strike w:val="false"/>
-                <w:sz w:val="22"/>
-                <w:szCs w:val="22"/>
-                <w:color w:val="000000"/>
+              <w:spacing w:after="60" w:before="60" w:line="240"/>
+              <w:ind w:left="60" w:right="60" w:firstLine="0" w:firstLineChars="0"/>
+              <w:rPr>
+                <w:rFonts w:ascii="Helvetica" w:hAnsi="Helvetica" w:eastAsia="Helvetica" w:cs="Helvetica"/>
+                <w:i w:val="false"/>
+                <w:b w:val="false"/>
+                <w:u w:val="none"/>
+                <w:strike w:val="false"/>
+                <w:sz w:val="17"/>
+                <w:szCs w:val="17"/>
+                <w:color w:val="24212B"/>
               </w:rPr>
             </w:pPr>
             <w:r>
@@ -469,9 +469,9 @@
                 <w:b w:val="false"/>
                 <w:u w:val="none"/>
                 <w:strike w:val="false"/>
-                <w:sz w:val="22"/>
-                <w:szCs w:val="22"/>
-                <w:color w:val="000000"/>
+                <w:sz w:val="17"/>
+                <w:szCs w:val="17"/>
+                <w:color w:val="24212B"/>
               </w:rPr>
               <w:t xml:space="preserve">4.70</w:t>
             </w:r>
@@ -496,24 +496,24 @@
           </w:tcPr>
           <w:p>
             <w:pPr>
-              <w:jc w:val="left"/>
+              <w:jc w:val="center"/>
               <w:pBdr>
                 <w:bottom w:val="none" w:sz="0" w:space="0" w:color="000000"/>
                 <w:top w:val="none" w:sz="0" w:space="0" w:color="000000"/>
                 <w:left w:val="none" w:sz="0" w:space="0" w:color="000000"/>
                 <w:right w:val="none" w:sz="0" w:space="0" w:color="000000"/>
               </w:pBdr>
-              <w:spacing w:after="100" w:before="100" w:line="240"/>
-              <w:ind w:left="100" w:right="100" w:firstLine="0" w:firstLineChars="0"/>
-              <w:rPr>
-                <w:rFonts w:ascii="Helvetica" w:hAnsi="Helvetica" w:eastAsia="Helvetica" w:cs="Helvetica"/>
-                <w:i w:val="false"/>
-                <w:b w:val="false"/>
-                <w:u w:val="none"/>
-                <w:strike w:val="false"/>
-                <w:sz w:val="22"/>
-                <w:szCs w:val="22"/>
-                <w:color w:val="000000"/>
+              <w:spacing w:after="60" w:before="60" w:line="240"/>
+              <w:ind w:left="60" w:right="60" w:firstLine="0" w:firstLineChars="0"/>
+              <w:rPr>
+                <w:rFonts w:ascii="Helvetica" w:hAnsi="Helvetica" w:eastAsia="Helvetica" w:cs="Helvetica"/>
+                <w:i w:val="false"/>
+                <w:b w:val="false"/>
+                <w:u w:val="none"/>
+                <w:strike w:val="false"/>
+                <w:sz w:val="17"/>
+                <w:szCs w:val="17"/>
+                <w:color w:val="24212B"/>
               </w:rPr>
             </w:pPr>
             <w:r>
@@ -523,9 +523,9 @@
                 <w:b w:val="false"/>
                 <w:u w:val="none"/>
                 <w:strike w:val="false"/>
-                <w:sz w:val="22"/>
-                <w:szCs w:val="22"/>
-                <w:color w:val="000000"/>
+                <w:sz w:val="17"/>
+                <w:szCs w:val="17"/>
+                <w:color w:val="24212B"/>
               </w:rPr>
               <w:t xml:space="preserve">0.002</w:t>
             </w:r>
@@ -550,6 +550,66 @@
           </w:tcPr>
           <w:p>
             <w:pPr>
+              <w:jc w:val="center"/>
+              <w:pBdr>
+                <w:bottom w:val="none" w:sz="0" w:space="0" w:color="000000"/>
+                <w:top w:val="none" w:sz="0" w:space="0" w:color="000000"/>
+                <w:left w:val="none" w:sz="0" w:space="0" w:color="000000"/>
+                <w:right w:val="none" w:sz="0" w:space="0" w:color="000000"/>
+              </w:pBdr>
+              <w:spacing w:after="60" w:before="60" w:line="240"/>
+              <w:ind w:left="60" w:right="60" w:firstLine="0" w:firstLineChars="0"/>
+              <w:rPr>
+                <w:rFonts w:ascii="Helvetica" w:hAnsi="Helvetica" w:eastAsia="Helvetica" w:cs="Helvetica"/>
+                <w:i w:val="false"/>
+                <w:b w:val="true"/>
+                <w:u w:val="none"/>
+                <w:strike w:val="false"/>
+                <w:sz w:val="17"/>
+                <w:szCs w:val="17"/>
+                <w:color w:val="24212B"/>
+              </w:rPr>
+            </w:pPr>
+            <w:r>
+              <w:rPr>
+                <w:rFonts w:ascii="Helvetica" w:hAnsi="Helvetica" w:eastAsia="Helvetica" w:cs="Helvetica"/>
+                <w:i w:val="false"/>
+                <w:b w:val="true"/>
+                <w:u w:val="none"/>
+                <w:strike w:val="false"/>
+                <w:sz w:val="17"/>
+                <w:szCs w:val="17"/>
+                <w:color w:val="24212B"/>
+              </w:rPr>
+              <w:t xml:space="preserve">**</w:t>
+            </w:r>
+          </w:p>
+        </w:tc>
+      </w:tr>
+      <w:tr>
+        <w:trPr>
+          <w:trHeight w:val="427" w:hRule="auto"/>
+        </w:trPr>
+        body2
+        <w:tc>
+          <w:tcPr>
+            <w:tcBorders>
+              <w:bottom w:val="none" w:sz="0" w:space="0" w:color="000000"/>
+              <w:top w:val="none" w:sz="0" w:space="0" w:color="000000"/>
+              <w:left w:val="none" w:sz="0" w:space="0" w:color="000000"/>
+              <w:right w:val="none" w:sz="0" w:space="0" w:color="000000"/>
+            </w:tcBorders>
+            <w:shd w:val="clear" w:color="auto" w:fill="FFFFFF"/>
+            <w:tcMar>
+              <w:top w:w="0" w:type="dxa"/>
+              <w:bottom w:w="0" w:type="dxa"/>
+              <w:left w:w="0" w:type="dxa"/>
+              <w:right w:w="0" w:type="dxa"/>
+            </w:tcMar>
+            <w:vAlign w:val="center"/>
+          </w:tcPr>
+          <w:p>
+            <w:pPr>
               <w:jc w:val="left"/>
               <w:pBdr>
                 <w:bottom w:val="none" w:sz="0" w:space="0" w:color="000000"/>
@@ -557,17 +617,17 @@
                 <w:left w:val="none" w:sz="0" w:space="0" w:color="000000"/>
                 <w:right w:val="none" w:sz="0" w:space="0" w:color="000000"/>
               </w:pBdr>
-              <w:spacing w:after="100" w:before="100" w:line="240"/>
-              <w:ind w:left="100" w:right="100" w:firstLine="0" w:firstLineChars="0"/>
-              <w:rPr>
-                <w:rFonts w:ascii="Helvetica" w:hAnsi="Helvetica" w:eastAsia="Helvetica" w:cs="Helvetica"/>
-                <w:i w:val="false"/>
-                <w:b w:val="false"/>
-                <w:u w:val="none"/>
-                <w:strike w:val="false"/>
-                <w:sz w:val="22"/>
-                <w:szCs w:val="22"/>
-                <w:color w:val="000000"/>
+              <w:spacing w:after="60" w:before="60" w:line="240"/>
+              <w:ind w:left="60" w:right="60" w:firstLine="0" w:firstLineChars="0"/>
+              <w:rPr>
+                <w:rFonts w:ascii="Helvetica" w:hAnsi="Helvetica" w:eastAsia="Helvetica" w:cs="Helvetica"/>
+                <w:i w:val="false"/>
+                <w:b w:val="false"/>
+                <w:u w:val="none"/>
+                <w:strike w:val="false"/>
+                <w:sz w:val="17"/>
+                <w:szCs w:val="17"/>
+                <w:color w:val="24212B"/>
               </w:rPr>
             </w:pPr>
             <w:r>
@@ -577,20 +637,236 @@
                 <w:b w:val="false"/>
                 <w:u w:val="none"/>
                 <w:strike w:val="false"/>
-                <w:sz w:val="22"/>
-                <w:szCs w:val="22"/>
-                <w:color w:val="000000"/>
-              </w:rPr>
-              <w:t xml:space="preserve">**</w:t>
+                <w:sz w:val="17"/>
+                <w:szCs w:val="17"/>
+                <w:color w:val="24212B"/>
+              </w:rPr>
+              <w:t xml:space="preserve">MDMA</w:t>
+            </w:r>
+          </w:p>
+        </w:tc>
+        <w:tc>
+          <w:tcPr>
+            <w:tcBorders>
+              <w:bottom w:val="none" w:sz="0" w:space="0" w:color="000000"/>
+              <w:top w:val="none" w:sz="0" w:space="0" w:color="000000"/>
+              <w:left w:val="none" w:sz="0" w:space="0" w:color="000000"/>
+              <w:right w:val="none" w:sz="0" w:space="0" w:color="000000"/>
+            </w:tcBorders>
+            <w:shd w:val="clear" w:color="auto" w:fill="FFFFFF"/>
+            <w:tcMar>
+              <w:top w:w="0" w:type="dxa"/>
+              <w:bottom w:w="0" w:type="dxa"/>
+              <w:left w:w="0" w:type="dxa"/>
+              <w:right w:w="0" w:type="dxa"/>
+            </w:tcMar>
+            <w:vAlign w:val="center"/>
+          </w:tcPr>
+          <w:p>
+            <w:pPr>
+              <w:jc w:val="center"/>
+              <w:pBdr>
+                <w:bottom w:val="none" w:sz="0" w:space="0" w:color="000000"/>
+                <w:top w:val="none" w:sz="0" w:space="0" w:color="000000"/>
+                <w:left w:val="none" w:sz="0" w:space="0" w:color="000000"/>
+                <w:right w:val="none" w:sz="0" w:space="0" w:color="000000"/>
+              </w:pBdr>
+              <w:spacing w:after="60" w:before="60" w:line="240"/>
+              <w:ind w:left="60" w:right="60" w:firstLine="0" w:firstLineChars="0"/>
+              <w:rPr>
+                <w:rFonts w:ascii="Helvetica" w:hAnsi="Helvetica" w:eastAsia="Helvetica" w:cs="Helvetica"/>
+                <w:i w:val="false"/>
+                <w:b w:val="false"/>
+                <w:u w:val="none"/>
+                <w:strike w:val="false"/>
+                <w:sz w:val="17"/>
+                <w:szCs w:val="17"/>
+                <w:color w:val="24212B"/>
+              </w:rPr>
+            </w:pPr>
+            <w:r>
+              <w:rPr>
+                <w:rFonts w:ascii="Helvetica" w:hAnsi="Helvetica" w:eastAsia="Helvetica" w:cs="Helvetica"/>
+                <w:i w:val="false"/>
+                <w:b w:val="false"/>
+                <w:u w:val="none"/>
+                <w:strike w:val="false"/>
+                <w:sz w:val="17"/>
+                <w:szCs w:val="17"/>
+                <w:color w:val="24212B"/>
+              </w:rPr>
+              <w:t xml:space="preserve">58</w:t>
+            </w:r>
+          </w:p>
+        </w:tc>
+        <w:tc>
+          <w:tcPr>
+            <w:tcBorders>
+              <w:bottom w:val="none" w:sz="0" w:space="0" w:color="000000"/>
+              <w:top w:val="none" w:sz="0" w:space="0" w:color="000000"/>
+              <w:left w:val="none" w:sz="0" w:space="0" w:color="000000"/>
+              <w:right w:val="none" w:sz="0" w:space="0" w:color="000000"/>
+            </w:tcBorders>
+            <w:shd w:val="clear" w:color="auto" w:fill="FFFFFF"/>
+            <w:tcMar>
+              <w:top w:w="0" w:type="dxa"/>
+              <w:bottom w:w="0" w:type="dxa"/>
+              <w:left w:w="0" w:type="dxa"/>
+              <w:right w:w="0" w:type="dxa"/>
+            </w:tcMar>
+            <w:vAlign w:val="center"/>
+          </w:tcPr>
+          <w:p>
+            <w:pPr>
+              <w:jc w:val="center"/>
+              <w:pBdr>
+                <w:bottom w:val="none" w:sz="0" w:space="0" w:color="000000"/>
+                <w:top w:val="none" w:sz="0" w:space="0" w:color="000000"/>
+                <w:left w:val="none" w:sz="0" w:space="0" w:color="000000"/>
+                <w:right w:val="none" w:sz="0" w:space="0" w:color="000000"/>
+              </w:pBdr>
+              <w:spacing w:after="60" w:before="60" w:line="240"/>
+              <w:ind w:left="60" w:right="60" w:firstLine="0" w:firstLineChars="0"/>
+              <w:rPr>
+                <w:rFonts w:ascii="Helvetica" w:hAnsi="Helvetica" w:eastAsia="Helvetica" w:cs="Helvetica"/>
+                <w:i w:val="false"/>
+                <w:b w:val="false"/>
+                <w:u w:val="none"/>
+                <w:strike w:val="false"/>
+                <w:sz w:val="17"/>
+                <w:szCs w:val="17"/>
+                <w:color w:val="24212B"/>
+              </w:rPr>
+            </w:pPr>
+            <w:r>
+              <w:rPr>
+                <w:rFonts w:ascii="Helvetica" w:hAnsi="Helvetica" w:eastAsia="Helvetica" w:cs="Helvetica"/>
+                <w:i w:val="false"/>
+                <w:b w:val="false"/>
+                <w:u w:val="none"/>
+                <w:strike w:val="false"/>
+                <w:sz w:val="17"/>
+                <w:szCs w:val="17"/>
+                <w:color w:val="24212B"/>
+              </w:rPr>
+              <w:t xml:space="preserve">0.55</w:t>
+            </w:r>
+          </w:p>
+        </w:tc>
+        <w:tc>
+          <w:tcPr>
+            <w:tcBorders>
+              <w:bottom w:val="none" w:sz="0" w:space="0" w:color="000000"/>
+              <w:top w:val="none" w:sz="0" w:space="0" w:color="000000"/>
+              <w:left w:val="none" w:sz="0" w:space="0" w:color="000000"/>
+              <w:right w:val="none" w:sz="0" w:space="0" w:color="000000"/>
+            </w:tcBorders>
+            <w:shd w:val="clear" w:color="auto" w:fill="FFFFFF"/>
+            <w:tcMar>
+              <w:top w:w="0" w:type="dxa"/>
+              <w:bottom w:w="0" w:type="dxa"/>
+              <w:left w:w="0" w:type="dxa"/>
+              <w:right w:w="0" w:type="dxa"/>
+            </w:tcMar>
+            <w:vAlign w:val="center"/>
+          </w:tcPr>
+          <w:p>
+            <w:pPr>
+              <w:jc w:val="center"/>
+              <w:pBdr>
+                <w:bottom w:val="none" w:sz="0" w:space="0" w:color="000000"/>
+                <w:top w:val="none" w:sz="0" w:space="0" w:color="000000"/>
+                <w:left w:val="none" w:sz="0" w:space="0" w:color="000000"/>
+                <w:right w:val="none" w:sz="0" w:space="0" w:color="000000"/>
+              </w:pBdr>
+              <w:spacing w:after="60" w:before="60" w:line="240"/>
+              <w:ind w:left="60" w:right="60" w:firstLine="0" w:firstLineChars="0"/>
+              <w:rPr>
+                <w:rFonts w:ascii="Helvetica" w:hAnsi="Helvetica" w:eastAsia="Helvetica" w:cs="Helvetica"/>
+                <w:i w:val="false"/>
+                <w:b w:val="false"/>
+                <w:u w:val="none"/>
+                <w:strike w:val="false"/>
+                <w:sz w:val="17"/>
+                <w:szCs w:val="17"/>
+                <w:color w:val="24212B"/>
+              </w:rPr>
+            </w:pPr>
+            <w:r>
+              <w:rPr>
+                <w:rFonts w:ascii="Helvetica" w:hAnsi="Helvetica" w:eastAsia="Helvetica" w:cs="Helvetica"/>
+                <w:i w:val="false"/>
+                <w:b w:val="false"/>
+                <w:u w:val="none"/>
+                <w:strike w:val="false"/>
+                <w:sz w:val="17"/>
+                <w:szCs w:val="17"/>
+                <w:color w:val="24212B"/>
+              </w:rPr>
+              <w:t xml:space="preserve">0.458</w:t>
+            </w:r>
+          </w:p>
+        </w:tc>
+        <w:tc>
+          <w:tcPr>
+            <w:tcBorders>
+              <w:bottom w:val="none" w:sz="0" w:space="0" w:color="000000"/>
+              <w:top w:val="none" w:sz="0" w:space="0" w:color="000000"/>
+              <w:left w:val="none" w:sz="0" w:space="0" w:color="000000"/>
+              <w:right w:val="none" w:sz="0" w:space="0" w:color="000000"/>
+            </w:tcBorders>
+            <w:shd w:val="clear" w:color="auto" w:fill="FFFFFF"/>
+            <w:tcMar>
+              <w:top w:w="0" w:type="dxa"/>
+              <w:bottom w:w="0" w:type="dxa"/>
+              <w:left w:w="0" w:type="dxa"/>
+              <w:right w:w="0" w:type="dxa"/>
+            </w:tcMar>
+            <w:vAlign w:val="center"/>
+          </w:tcPr>
+          <w:p>
+            <w:pPr>
+              <w:jc w:val="center"/>
+              <w:pBdr>
+                <w:bottom w:val="none" w:sz="0" w:space="0" w:color="000000"/>
+                <w:top w:val="none" w:sz="0" w:space="0" w:color="000000"/>
+                <w:left w:val="none" w:sz="0" w:space="0" w:color="000000"/>
+                <w:right w:val="none" w:sz="0" w:space="0" w:color="000000"/>
+              </w:pBdr>
+              <w:spacing w:after="60" w:before="60" w:line="240"/>
+              <w:ind w:left="60" w:right="60" w:firstLine="0" w:firstLineChars="0"/>
+              <w:rPr>
+                <w:rFonts w:ascii="Helvetica" w:hAnsi="Helvetica" w:eastAsia="Helvetica" w:cs="Helvetica"/>
+                <w:i w:val="false"/>
+                <w:b w:val="false"/>
+                <w:u w:val="none"/>
+                <w:strike w:val="false"/>
+                <w:sz w:val="17"/>
+                <w:szCs w:val="17"/>
+                <w:color w:val="24212B"/>
+              </w:rPr>
+            </w:pPr>
+            <w:r>
+              <w:rPr>
+                <w:rFonts w:ascii="Helvetica" w:hAnsi="Helvetica" w:eastAsia="Helvetica" w:cs="Helvetica"/>
+                <w:i w:val="false"/>
+                <w:b w:val="false"/>
+                <w:u w:val="none"/>
+                <w:strike w:val="false"/>
+                <w:sz w:val="17"/>
+                <w:szCs w:val="17"/>
+                <w:color w:val="24212B"/>
+              </w:rPr>
+              <w:t xml:space="preserve"/>
             </w:r>
           </w:p>
         </w:tc>
       </w:tr>
       <w:tr>
         <w:trPr>
-          <w:trHeight w:val="360" w:hRule="auto"/>
+          <w:trHeight w:val="433" w:hRule="auto"/>
         </w:trPr>
-        body2
+        body3
         <w:tc>
           <w:tcPr>
             <w:tcBorders>
@@ -617,17 +893,17 @@
                 <w:left w:val="none" w:sz="0" w:space="0" w:color="000000"/>
                 <w:right w:val="none" w:sz="0" w:space="0" w:color="000000"/>
               </w:pBdr>
-              <w:spacing w:after="100" w:before="100" w:line="240"/>
-              <w:ind w:left="100" w:right="100" w:firstLine="0" w:firstLineChars="0"/>
-              <w:rPr>
-                <w:rFonts w:ascii="Helvetica" w:hAnsi="Helvetica" w:eastAsia="Helvetica" w:cs="Helvetica"/>
-                <w:i w:val="false"/>
-                <w:b w:val="false"/>
-                <w:u w:val="none"/>
-                <w:strike w:val="false"/>
-                <w:sz w:val="22"/>
-                <w:szCs w:val="22"/>
-                <w:color w:val="000000"/>
+              <w:spacing w:after="60" w:before="60" w:line="240"/>
+              <w:ind w:left="60" w:right="60" w:firstLine="0" w:firstLineChars="0"/>
+              <w:rPr>
+                <w:rFonts w:ascii="Helvetica" w:hAnsi="Helvetica" w:eastAsia="Helvetica" w:cs="Helvetica"/>
+                <w:i w:val="false"/>
+                <w:b w:val="false"/>
+                <w:u w:val="none"/>
+                <w:strike w:val="false"/>
+                <w:sz w:val="17"/>
+                <w:szCs w:val="17"/>
+                <w:color w:val="24212B"/>
               </w:rPr>
             </w:pPr>
             <w:r>
@@ -637,11 +913,11 @@
                 <w:b w:val="false"/>
                 <w:u w:val="none"/>
                 <w:strike w:val="false"/>
-                <w:sz w:val="22"/>
-                <w:szCs w:val="22"/>
-                <w:color w:val="000000"/>
-              </w:rPr>
-              <w:t xml:space="preserve">MDMA</w:t>
+                <w:sz w:val="17"/>
+                <w:szCs w:val="17"/>
+                <w:color w:val="24212B"/>
+              </w:rPr>
+              <w:t xml:space="preserve">PSILOCYBIN</w:t>
             </w:r>
           </w:p>
         </w:tc>
@@ -664,24 +940,24 @@
           </w:tcPr>
           <w:p>
             <w:pPr>
-              <w:jc w:val="right"/>
+              <w:jc w:val="center"/>
               <w:pBdr>
                 <w:bottom w:val="none" w:sz="0" w:space="0" w:color="000000"/>
                 <w:top w:val="none" w:sz="0" w:space="0" w:color="000000"/>
                 <w:left w:val="none" w:sz="0" w:space="0" w:color="000000"/>
                 <w:right w:val="none" w:sz="0" w:space="0" w:color="000000"/>
               </w:pBdr>
-              <w:spacing w:after="100" w:before="100" w:line="240"/>
-              <w:ind w:left="100" w:right="100" w:firstLine="0" w:firstLineChars="0"/>
-              <w:rPr>
-                <w:rFonts w:ascii="Helvetica" w:hAnsi="Helvetica" w:eastAsia="Helvetica" w:cs="Helvetica"/>
-                <w:i w:val="false"/>
-                <w:b w:val="false"/>
-                <w:u w:val="none"/>
-                <w:strike w:val="false"/>
-                <w:sz w:val="22"/>
-                <w:szCs w:val="22"/>
-                <w:color w:val="000000"/>
+              <w:spacing w:after="60" w:before="60" w:line="240"/>
+              <w:ind w:left="60" w:right="60" w:firstLine="0" w:firstLineChars="0"/>
+              <w:rPr>
+                <w:rFonts w:ascii="Helvetica" w:hAnsi="Helvetica" w:eastAsia="Helvetica" w:cs="Helvetica"/>
+                <w:i w:val="false"/>
+                <w:b w:val="false"/>
+                <w:u w:val="none"/>
+                <w:strike w:val="false"/>
+                <w:sz w:val="17"/>
+                <w:szCs w:val="17"/>
+                <w:color w:val="24212B"/>
               </w:rPr>
             </w:pPr>
             <w:r>
@@ -691,11 +967,11 @@
                 <w:b w:val="false"/>
                 <w:u w:val="none"/>
                 <w:strike w:val="false"/>
-                <w:sz w:val="22"/>
-                <w:szCs w:val="22"/>
-                <w:color w:val="000000"/>
-              </w:rPr>
-              <w:t xml:space="preserve">75</w:t>
+                <w:sz w:val="17"/>
+                <w:szCs w:val="17"/>
+                <w:color w:val="24212B"/>
+              </w:rPr>
+              <w:t xml:space="preserve">30</w:t>
             </w:r>
           </w:p>
         </w:tc>
@@ -718,24 +994,24 @@
           </w:tcPr>
           <w:p>
             <w:pPr>
-              <w:jc w:val="left"/>
+              <w:jc w:val="center"/>
               <w:pBdr>
                 <w:bottom w:val="none" w:sz="0" w:space="0" w:color="000000"/>
                 <w:top w:val="none" w:sz="0" w:space="0" w:color="000000"/>
                 <w:left w:val="none" w:sz="0" w:space="0" w:color="000000"/>
                 <w:right w:val="none" w:sz="0" w:space="0" w:color="000000"/>
               </w:pBdr>
-              <w:spacing w:after="100" w:before="100" w:line="240"/>
-              <w:ind w:left="100" w:right="100" w:firstLine="0" w:firstLineChars="0"/>
-              <w:rPr>
-                <w:rFonts w:ascii="Helvetica" w:hAnsi="Helvetica" w:eastAsia="Helvetica" w:cs="Helvetica"/>
-                <w:i w:val="false"/>
-                <w:b w:val="false"/>
-                <w:u w:val="none"/>
-                <w:strike w:val="false"/>
-                <w:sz w:val="22"/>
-                <w:szCs w:val="22"/>
-                <w:color w:val="000000"/>
+              <w:spacing w:after="60" w:before="60" w:line="240"/>
+              <w:ind w:left="60" w:right="60" w:firstLine="0" w:firstLineChars="0"/>
+              <w:rPr>
+                <w:rFonts w:ascii="Helvetica" w:hAnsi="Helvetica" w:eastAsia="Helvetica" w:cs="Helvetica"/>
+                <w:i w:val="false"/>
+                <w:b w:val="false"/>
+                <w:u w:val="none"/>
+                <w:strike w:val="false"/>
+                <w:sz w:val="17"/>
+                <w:szCs w:val="17"/>
+                <w:color w:val="24212B"/>
               </w:rPr>
             </w:pPr>
             <w:r>
@@ -745,11 +1021,11 @@
                 <w:b w:val="false"/>
                 <w:u w:val="none"/>
                 <w:strike w:val="false"/>
-                <w:sz w:val="22"/>
-                <w:szCs w:val="22"/>
-                <w:color w:val="000000"/>
-              </w:rPr>
-              <w:t xml:space="preserve">0.00</w:t>
+                <w:sz w:val="17"/>
+                <w:szCs w:val="17"/>
+                <w:color w:val="24212B"/>
+              </w:rPr>
+              <w:t xml:space="preserve">0.01</w:t>
             </w:r>
           </w:p>
         </w:tc>
@@ -772,24 +1048,24 @@
           </w:tcPr>
           <w:p>
             <w:pPr>
-              <w:jc w:val="left"/>
+              <w:jc w:val="center"/>
               <w:pBdr>
                 <w:bottom w:val="none" w:sz="0" w:space="0" w:color="000000"/>
                 <w:top w:val="none" w:sz="0" w:space="0" w:color="000000"/>
                 <w:left w:val="none" w:sz="0" w:space="0" w:color="000000"/>
                 <w:right w:val="none" w:sz="0" w:space="0" w:color="000000"/>
               </w:pBdr>
-              <w:spacing w:after="100" w:before="100" w:line="240"/>
-              <w:ind w:left="100" w:right="100" w:firstLine="0" w:firstLineChars="0"/>
-              <w:rPr>
-                <w:rFonts w:ascii="Helvetica" w:hAnsi="Helvetica" w:eastAsia="Helvetica" w:cs="Helvetica"/>
-                <w:i w:val="false"/>
-                <w:b w:val="false"/>
-                <w:u w:val="none"/>
-                <w:strike w:val="false"/>
-                <w:sz w:val="22"/>
-                <w:szCs w:val="22"/>
-                <w:color w:val="000000"/>
+              <w:spacing w:after="60" w:before="60" w:line="240"/>
+              <w:ind w:left="60" w:right="60" w:firstLine="0" w:firstLineChars="0"/>
+              <w:rPr>
+                <w:rFonts w:ascii="Helvetica" w:hAnsi="Helvetica" w:eastAsia="Helvetica" w:cs="Helvetica"/>
+                <w:i w:val="false"/>
+                <w:b w:val="false"/>
+                <w:u w:val="none"/>
+                <w:strike w:val="false"/>
+                <w:sz w:val="17"/>
+                <w:szCs w:val="17"/>
+                <w:color w:val="24212B"/>
               </w:rPr>
             </w:pPr>
             <w:r>
@@ -799,11 +1075,11 @@
                 <w:b w:val="false"/>
                 <w:u w:val="none"/>
                 <w:strike w:val="false"/>
-                <w:sz w:val="22"/>
-                <w:szCs w:val="22"/>
-                <w:color w:val="000000"/>
-              </w:rPr>
-              <w:t xml:space="preserve">0.534</w:t>
+                <w:sz w:val="17"/>
+                <w:szCs w:val="17"/>
+                <w:color w:val="24212B"/>
+              </w:rPr>
+              <w:t xml:space="preserve">0.923</w:t>
             </w:r>
           </w:p>
         </w:tc>
@@ -826,24 +1102,24 @@
           </w:tcPr>
           <w:p>
             <w:pPr>
-              <w:jc w:val="left"/>
+              <w:jc w:val="center"/>
               <w:pBdr>
                 <w:bottom w:val="none" w:sz="0" w:space="0" w:color="000000"/>
                 <w:top w:val="none" w:sz="0" w:space="0" w:color="000000"/>
                 <w:left w:val="none" w:sz="0" w:space="0" w:color="000000"/>
                 <w:right w:val="none" w:sz="0" w:space="0" w:color="000000"/>
               </w:pBdr>
-              <w:spacing w:after="100" w:before="100" w:line="240"/>
-              <w:ind w:left="100" w:right="100" w:firstLine="0" w:firstLineChars="0"/>
-              <w:rPr>
-                <w:rFonts w:ascii="Helvetica" w:hAnsi="Helvetica" w:eastAsia="Helvetica" w:cs="Helvetica"/>
-                <w:i w:val="false"/>
-                <w:b w:val="false"/>
-                <w:u w:val="none"/>
-                <w:strike w:val="false"/>
-                <w:sz w:val="22"/>
-                <w:szCs w:val="22"/>
-                <w:color w:val="000000"/>
+              <w:spacing w:after="60" w:before="60" w:line="240"/>
+              <w:ind w:left="60" w:right="60" w:firstLine="0" w:firstLineChars="0"/>
+              <w:rPr>
+                <w:rFonts w:ascii="Helvetica" w:hAnsi="Helvetica" w:eastAsia="Helvetica" w:cs="Helvetica"/>
+                <w:i w:val="false"/>
+                <w:b w:val="false"/>
+                <w:u w:val="none"/>
+                <w:strike w:val="false"/>
+                <w:sz w:val="17"/>
+                <w:szCs w:val="17"/>
+                <w:color w:val="24212B"/>
               </w:rPr>
             </w:pPr>
             <w:r>
@@ -853,9 +1129,9 @@
                 <w:b w:val="false"/>
                 <w:u w:val="none"/>
                 <w:strike w:val="false"/>
-                <w:sz w:val="22"/>
-                <w:szCs w:val="22"/>
-                <w:color w:val="000000"/>
+                <w:sz w:val="17"/>
+                <w:szCs w:val="17"/>
+                <w:color w:val="24212B"/>
               </w:rPr>
               <w:t xml:space="preserve"/>
             </w:r>

</xml_diff>

<commit_message>
Update v5 data and clinical absolute-rate supplements
</commit_message>
<xml_diff>
--- a/results/paper_tables/follow_up/01_dr_global_by_molecule.docx
+++ b/results/paper_tables/follow_up/01_dr_global_by_molecule.docx
@@ -419,7 +419,7 @@
                 <w:szCs w:val="17"/>
                 <w:color w:val="24212B"/>
               </w:rPr>
-              <w:t xml:space="preserve">108</w:t>
+              <w:t xml:space="preserve">163</w:t>
             </w:r>
           </w:p>
         </w:tc>
@@ -473,7 +473,7 @@
                 <w:szCs w:val="17"/>
                 <w:color w:val="24212B"/>
               </w:rPr>
-              <w:t xml:space="preserve">4.70</w:t>
+              <w:t xml:space="preserve">4.80</w:t>
             </w:r>
           </w:p>
         </w:tc>
@@ -527,7 +527,7 @@
                 <w:szCs w:val="17"/>
                 <w:color w:val="24212B"/>
               </w:rPr>
-              <w:t xml:space="preserve">0.002</w:t>
+              <w:t xml:space="preserve">&lt;0.001</w:t>
             </w:r>
           </w:p>
         </w:tc>
@@ -581,7 +581,7 @@
                 <w:szCs w:val="17"/>
                 <w:color w:val="24212B"/>
               </w:rPr>
-              <w:t xml:space="preserve">**</w:t>
+              <w:t xml:space="preserve">***</w:t>
             </w:r>
           </w:p>
         </w:tc>
@@ -695,7 +695,7 @@
                 <w:szCs w:val="17"/>
                 <w:color w:val="24212B"/>
               </w:rPr>
-              <w:t xml:space="preserve">58</w:t>
+              <w:t xml:space="preserve">75</w:t>
             </w:r>
           </w:p>
         </w:tc>
@@ -749,7 +749,7 @@
                 <w:szCs w:val="17"/>
                 <w:color w:val="24212B"/>
               </w:rPr>
-              <w:t xml:space="preserve">0.55</w:t>
+              <w:t xml:space="preserve">1.11</w:t>
             </w:r>
           </w:p>
         </w:tc>
@@ -803,7 +803,7 @@
                 <w:szCs w:val="17"/>
                 <w:color w:val="24212B"/>
               </w:rPr>
-              <w:t xml:space="preserve">0.458</w:t>
+              <w:t xml:space="preserve">0.291</w:t>
             </w:r>
           </w:p>
         </w:tc>

</xml_diff>